<commit_message>
atualização de organização e adicionei arquivos de material
Arquivos de exercícios lógicos e de MER atualizados para atividades de banco de dados. Remoção de um arquivo temporário do Word. PDFs de aulas em HTML/CSS movidos e adicionados à pasta "materiais_aula". Adição de um novo documento de questionário para projetos de software.
</commit_message>
<xml_diff>
--- a/2°_SEMESTRE/BANCO_DE_DADOS/atividades_avaliativas/exercicios_br_modelo/mer_dos_dois_exercicios_monica.docx
+++ b/2°_SEMESTRE/BANCO_DE_DADOS/atividades_avaliativas/exercicios_br_modelo/mer_dos_dois_exercicios_monica.docx
@@ -6,6 +6,7 @@
       <w:pPr>
         <w:rPr>
           <w:rFonts w:ascii="Arial" w:hAnsi="Arial" w:cs="Arial"/>
+          <w:b/>
           <w:sz w:val="28"/>
           <w:szCs w:val="28"/>
         </w:rPr>
@@ -13,6 +14,7 @@
       <w:r>
         <w:rPr>
           <w:rFonts w:ascii="Arial" w:hAnsi="Arial" w:cs="Arial"/>
+          <w:b/>
           <w:sz w:val="28"/>
           <w:szCs w:val="28"/>
         </w:rPr>
@@ -42,7 +44,18 @@
           <w:sz w:val="24"/>
           <w:szCs w:val="24"/>
         </w:rPr>
-        <w:t>ENTIDADES:</w:t>
+        <w:t>ENTID</w:t>
+      </w:r>
+      <w:bookmarkStart w:id="0" w:name="_GoBack"/>
+      <w:bookmarkEnd w:id="0"/>
+      <w:r>
+        <w:rPr>
+          <w:rFonts w:ascii="Arial" w:hAnsi="Arial" w:cs="Arial"/>
+          <w:b/>
+          <w:sz w:val="24"/>
+          <w:szCs w:val="24"/>
+        </w:rPr>
+        <w:t>ADES:</w:t>
       </w:r>
     </w:p>
     <w:p>
@@ -809,13 +822,12 @@
           <w:rFonts w:ascii="Arial" w:hAnsi="Arial" w:cs="Arial"/>
         </w:rPr>
       </w:pPr>
-      <w:bookmarkStart w:id="0" w:name="_GoBack"/>
-      <w:bookmarkEnd w:id="0"/>
-    </w:p>
-    <w:p>
-      <w:pPr>
-        <w:rPr>
-          <w:rFonts w:ascii="Arial" w:hAnsi="Arial" w:cs="Arial"/>
+    </w:p>
+    <w:p>
+      <w:pPr>
+        <w:rPr>
+          <w:rFonts w:ascii="Arial" w:hAnsi="Arial" w:cs="Arial"/>
+          <w:b/>
           <w:sz w:val="28"/>
           <w:szCs w:val="28"/>
         </w:rPr>
@@ -823,6 +835,7 @@
       <w:r>
         <w:rPr>
           <w:rFonts w:ascii="Arial" w:hAnsi="Arial" w:cs="Arial"/>
+          <w:b/>
           <w:sz w:val="28"/>
           <w:szCs w:val="28"/>
         </w:rPr>

</xml_diff>